<commit_message>
Initial commit: Real Estate ML Intelligence Platform
</commit_message>
<xml_diff>
--- a/Real Estate Intelligence System.docx
+++ b/Real Estate Intelligence System.docx
@@ -65,7 +65,7 @@
     </w:p>
     <w:p>
       <w:r>
-        <w:t>The system covers three distinct property segments — Apartments, Builder Floors, and Plots/Land — with separate ML pipelines optimised for each segment's unique valuation drivers. Beyond simple price estimation, the platform delivers forecast intelligence (5-year quarterly horizon), locality-level market heat indices, ROI calculators, buy/watch/avoid recommendations, and explainable-AI narratives for every prediction.</w:t>
+        <w:t>The system covers three distinct property segments — Apartments, Builder Floors, and Plots/Land — with separate ML pipelines optimised for each segment's unique valuation drivers. Beyond simple price estimation, the platform delivers forecast intelligence (5-year quarterly horizon), locality-level market heat indices, ROI calculators, Buy / Hold Neutral / Avoid recommendations, and explainable-AI narratives for every prediction.</w:t>
       </w:r>
     </w:p>
     <w:p/>
@@ -2067,7 +2067,7 @@
           </w:tcPr>
           <w:p>
             <w:r>
-              <w:t>Buy if Score ≥ 68  |  Watch if Score ≥ 50  |  Avoid otherwise</w:t>
+              <w:t>Buy if Score ≥ 68  |  Hold / Neutral if Score ≥ 50  |  Avoid otherwise</w:t>
             </w:r>
           </w:p>
         </w:tc>
@@ -2910,7 +2910,9 @@
           </w:tcPr>
           <w:p>
             <w:r>
-              <w:t>Delhi, Noida, Gurgaon, Faridabad, Ghaziabad, Greater Noida, Jaipur</w:t>
+              <w:t>Delhi, Noida, Gurgaon, Faridabad, Ghaziabad, Greater Noida, Jaipur (prediction models)</w:t>
+              <w:br/>
+              <w:t>Circle rate coverage: above 7 + Pune, Alwar, Aligarh (10 cities, 12,493 localities total)</w:t>
             </w:r>
           </w:p>
         </w:tc>
@@ -3030,7 +3032,7 @@
           </w:tcPr>
           <w:p>
             <w:r>
-              <w:t>APT v3 (1.85 GB), Builder Floor v2 (858 MB), Plot v1 (11.5 MB)</w:t>
+              <w:t>APT v4, Builder Floor v2, Plot v1 (versioned via model_registry.json)</w:t>
             </w:r>
           </w:p>
         </w:tc>
@@ -3582,7 +3584,7 @@
           </w:tcPr>
           <w:p>
             <w:r>
-              <w:t>Buy/Watch/Avoid score and recommendation</w:t>
+              <w:t>Buy / Hold Neutral / Avoid score and recommendation</w:t>
             </w:r>
           </w:p>
         </w:tc>
@@ -3913,7 +3915,7 @@
           </w:tcPr>
           <w:p>
             <w:r>
-              <w:t>Locality search → 5-year forecast chart, YoY trend, distribution band, quarter table, buy/watch/avoid badge, ROI panel</w:t>
+              <w:t>Locality search → 5-year forecast chart, YoY trend, distribution band, quarter table, Buy / Hold Neutral / Avoid badge, ROI panel</w:t>
             </w:r>
           </w:p>
         </w:tc>
@@ -3962,6 +3964,30 @@
           <w:p>
             <w:r>
               <w:t>Locality search → market heat index gauge, supply/demand KPI cards, absorption chart, price-cut/hike trend</w:t>
+            </w:r>
+          </w:p>
+        </w:tc>
+      </w:tr>
+      <w:tr>
+        <w:tc>
+          <w:tcPr>
+            <w:tcW w:w="4703" w:type="dxa"/>
+            <w:shd w:val="clear" w:color="auto" w:fill="FFFFFF"/>
+          </w:tcPr>
+          <w:p>
+            <w:r>
+              <w:t>Property Intelligence</w:t>
+            </w:r>
+          </w:p>
+        </w:tc>
+        <w:tc>
+          <w:tcPr>
+            <w:tcW w:w="4703" w:type="dxa"/>
+            <w:shd w:val="clear" w:color="auto" w:fill="FFFFFF"/>
+          </w:tcPr>
+          <w:p>
+            <w:r>
+              <w:t>City × locality search → asking price vs. model estimate, 5-tier recommendation (Strong Buy / Buy / Hold Neutral / Caution / Avoid), detailed valuation breakdown with color-coded badge</w:t>
             </w:r>
           </w:p>
         </w:tc>
@@ -4414,6 +4440,1262 @@
     </w:tbl>
     <w:p/>
     <w:p/>
+    <w:p>
+      <w:pPr>
+        <w:pStyle w:val="Heading1"/>
+      </w:pPr>
+      <w:r>
+        <w:t>14. MLOps &amp; MLflow Experiment Tracking</w:t>
+      </w:r>
+    </w:p>
+    <w:p>
+      <w:r>
+        <w:t>The platform includes a full MLOps pipeline with automatic version management, experiment tracking via MLflow, and a canonical model promotion pattern. Every training run produces a versioned snapshot, logs metrics to a SQLite-backed MLflow store, and promotes the winning model to a canonical path that the API always reads — so the API never needs a restart after retraining.</w:t>
+      </w:r>
+    </w:p>
+    <w:p>
+      <w:pPr>
+        <w:pStyle w:val="Heading2"/>
+      </w:pPr>
+      <w:r>
+        <w:t>14.1 Pipeline Architecture</w:t>
+      </w:r>
+    </w:p>
+    <w:p>
+      <w:r>
+        <w:t>The ML pipeline is split into three independent entry points, one per property segment, each orchestrating: Data Ingestion → Data Transformation → Model Training → Registry Update → MLflow Log.</w:t>
+      </w:r>
+    </w:p>
+    <w:tbl>
+      <w:tblPr>
+        <w:tblStyle w:val="TableGrid"/>
+        <w:tblW w:type="auto" w:w="0"/>
+        <w:tblLook w:firstColumn="1" w:firstRow="1" w:lastColumn="0" w:lastRow="0" w:noHBand="0" w:noVBand="1" w:val="04A0"/>
+      </w:tblPr>
+      <w:tblGrid>
+        <w:gridCol w:w="3135"/>
+        <w:gridCol w:w="3135"/>
+        <w:gridCol w:w="3135"/>
+      </w:tblGrid>
+      <w:tr>
+        <w:tc>
+          <w:tcPr>
+            <w:tcW w:type="dxa" w:w="3135"/>
+          </w:tcPr>
+          <w:p>
+            <w:r>
+              <w:rPr>
+                <w:b/>
+              </w:rPr>
+              <w:t>Entry Point</w:t>
+            </w:r>
+          </w:p>
+        </w:tc>
+        <w:tc>
+          <w:tcPr>
+            <w:tcW w:type="dxa" w:w="3135"/>
+          </w:tcPr>
+          <w:p>
+            <w:r>
+              <w:rPr>
+                <w:b/>
+              </w:rPr>
+              <w:t>Segment</w:t>
+            </w:r>
+          </w:p>
+        </w:tc>
+        <w:tc>
+          <w:tcPr>
+            <w:tcW w:type="dxa" w:w="3135"/>
+          </w:tcPr>
+          <w:p>
+            <w:r>
+              <w:rPr>
+                <w:b/>
+              </w:rPr>
+              <w:t>What It Does</w:t>
+            </w:r>
+          </w:p>
+        </w:tc>
+      </w:tr>
+      <w:tr>
+        <w:tc>
+          <w:tcPr>
+            <w:tcW w:type="dxa" w:w="3135"/>
+          </w:tcPr>
+          <w:p>
+            <w:r>
+              <w:t>app_apt_train.py</w:t>
+            </w:r>
+          </w:p>
+        </w:tc>
+        <w:tc>
+          <w:tcPr>
+            <w:tcW w:type="dxa" w:w="3135"/>
+          </w:tcPr>
+          <w:p>
+            <w:r>
+              <w:t>Apartment</w:t>
+            </w:r>
+          </w:p>
+        </w:tc>
+        <w:tc>
+          <w:tcPr>
+            <w:tcW w:type="dxa" w:w="3135"/>
+          </w:tcPr>
+          <w:p>
+            <w:r>
+              <w:t>Ingest CSVs → clean → train → register APT model</w:t>
+            </w:r>
+          </w:p>
+        </w:tc>
+      </w:tr>
+      <w:tr>
+        <w:tc>
+          <w:tcPr>
+            <w:tcW w:type="dxa" w:w="3135"/>
+          </w:tcPr>
+          <w:p>
+            <w:r>
+              <w:t>app_bf_train.py</w:t>
+            </w:r>
+          </w:p>
+        </w:tc>
+        <w:tc>
+          <w:tcPr>
+            <w:tcW w:type="dxa" w:w="3135"/>
+          </w:tcPr>
+          <w:p>
+            <w:r>
+              <w:t>Builder Floor</w:t>
+            </w:r>
+          </w:p>
+        </w:tc>
+        <w:tc>
+          <w:tcPr>
+            <w:tcW w:type="dxa" w:w="3135"/>
+          </w:tcPr>
+          <w:p>
+            <w:r>
+              <w:t>Ingest CSVs → clean → train → register BF model</w:t>
+            </w:r>
+          </w:p>
+        </w:tc>
+      </w:tr>
+      <w:tr>
+        <w:tc>
+          <w:tcPr>
+            <w:tcW w:type="dxa" w:w="3135"/>
+          </w:tcPr>
+          <w:p>
+            <w:r>
+              <w:t>app_plot_train.py</w:t>
+            </w:r>
+          </w:p>
+        </w:tc>
+        <w:tc>
+          <w:tcPr>
+            <w:tcW w:type="dxa" w:w="3135"/>
+          </w:tcPr>
+          <w:p>
+            <w:r>
+              <w:t>Plot / Land</w:t>
+            </w:r>
+          </w:p>
+        </w:tc>
+        <w:tc>
+          <w:tcPr>
+            <w:tcW w:type="dxa" w:w="3135"/>
+          </w:tcPr>
+          <w:p>
+            <w:r>
+              <w:t>Ingest from PostgreSQL → clean → train → register Plot model</w:t>
+            </w:r>
+          </w:p>
+        </w:tc>
+      </w:tr>
+      <w:tr>
+        <w:tc>
+          <w:tcPr>
+            <w:tcW w:type="dxa" w:w="3135"/>
+          </w:tcPr>
+          <w:p>
+            <w:r>
+              <w:t>app.py</w:t>
+            </w:r>
+          </w:p>
+        </w:tc>
+        <w:tc>
+          <w:tcPr>
+            <w:tcW w:type="dxa" w:w="3135"/>
+          </w:tcPr>
+          <w:p>
+            <w:r>
+              <w:t>All</w:t>
+            </w:r>
+          </w:p>
+        </w:tc>
+        <w:tc>
+          <w:tcPr>
+            <w:tcW w:type="dxa" w:w="3135"/>
+          </w:tcPr>
+          <w:p>
+            <w:r>
+              <w:t>Ingestion + transformation only (no model training)</w:t>
+            </w:r>
+          </w:p>
+        </w:tc>
+      </w:tr>
+    </w:tbl>
+    <w:p>
+      <w:pPr>
+        <w:pStyle w:val="Heading2"/>
+      </w:pPr>
+      <w:r>
+        <w:t>14.2 Versioned Artifact Directory</w:t>
+      </w:r>
+    </w:p>
+    <w:p>
+      <w:r>
+        <w:t>Every training run writes its outputs to a versioned subdirectory artifact/.../ v{N}/ AND promotes to a canonical root path. The API always loads from the canonical root, so no API restart is needed after retraining.</w:t>
+      </w:r>
+    </w:p>
+    <w:tbl>
+      <w:tblPr>
+        <w:tblStyle w:val="TableGrid"/>
+        <w:tblW w:type="auto" w:w="0"/>
+        <w:tblLook w:firstColumn="1" w:firstRow="1" w:lastColumn="0" w:lastRow="0" w:noHBand="0" w:noVBand="1" w:val="04A0"/>
+      </w:tblPr>
+      <w:tblGrid>
+        <w:gridCol w:w="4703"/>
+        <w:gridCol w:w="4703"/>
+      </w:tblGrid>
+      <w:tr>
+        <w:tc>
+          <w:tcPr>
+            <w:tcW w:type="dxa" w:w="4703"/>
+          </w:tcPr>
+          <w:p>
+            <w:r>
+              <w:rPr>
+                <w:b/>
+              </w:rPr>
+              <w:t>Path</w:t>
+            </w:r>
+          </w:p>
+        </w:tc>
+        <w:tc>
+          <w:tcPr>
+            <w:tcW w:type="dxa" w:w="4703"/>
+          </w:tcPr>
+          <w:p>
+            <w:r>
+              <w:rPr>
+                <w:b/>
+              </w:rPr>
+              <w:t>Description</w:t>
+            </w:r>
+          </w:p>
+        </w:tc>
+      </w:tr>
+      <w:tr>
+        <w:tc>
+          <w:tcPr>
+            <w:tcW w:type="dxa" w:w="4703"/>
+          </w:tcPr>
+          <w:p>
+            <w:r>
+              <w:t>artifact/model_registry.json</w:t>
+            </w:r>
+          </w:p>
+        </w:tc>
+        <w:tc>
+          <w:tcPr>
+            <w:tcW w:type="dxa" w:w="4703"/>
+          </w:tcPr>
+          <w:p>
+            <w:r>
+              <w:t>Central registry tracking all versions, timestamps, metrics</w:t>
+            </w:r>
+          </w:p>
+        </w:tc>
+      </w:tr>
+      <w:tr>
+        <w:tc>
+          <w:tcPr>
+            <w:tcW w:type="dxa" w:w="4703"/>
+          </w:tcPr>
+          <w:p>
+            <w:r>
+              <w:t>artifact/mlflow.db</w:t>
+            </w:r>
+          </w:p>
+        </w:tc>
+        <w:tc>
+          <w:tcPr>
+            <w:tcW w:type="dxa" w:w="4703"/>
+          </w:tcPr>
+          <w:p>
+            <w:r>
+              <w:t>SQLite backend for MLflow experiment tracking</w:t>
+            </w:r>
+          </w:p>
+        </w:tc>
+      </w:tr>
+      <w:tr>
+        <w:tc>
+          <w:tcPr>
+            <w:tcW w:type="dxa" w:w="4703"/>
+          </w:tcPr>
+          <w:p>
+            <w:r>
+              <w:t>artifact/data_ingestion/v{N}/raw/*.csv</w:t>
+            </w:r>
+          </w:p>
+        </w:tc>
+        <w:tc>
+          <w:tcPr>
+            <w:tcW w:type="dxa" w:w="4703"/>
+          </w:tcPr>
+          <w:p>
+            <w:r>
+              <w:t>Snapshot of source CSVs at time of run N</w:t>
+            </w:r>
+          </w:p>
+        </w:tc>
+      </w:tr>
+      <w:tr>
+        <w:tc>
+          <w:tcPr>
+            <w:tcW w:type="dxa" w:w="4703"/>
+          </w:tcPr>
+          <w:p>
+            <w:r>
+              <w:t>artifact/data_ingestion/v{N}/merged/merged.csv</w:t>
+            </w:r>
+          </w:p>
+        </w:tc>
+        <w:tc>
+          <w:tcPr>
+            <w:tcW w:type="dxa" w:w="4703"/>
+          </w:tcPr>
+          <w:p>
+            <w:r>
+              <w:t>Merged raw data for run N</w:t>
+            </w:r>
+          </w:p>
+        </w:tc>
+      </w:tr>
+      <w:tr>
+        <w:tc>
+          <w:tcPr>
+            <w:tcW w:type="dxa" w:w="4703"/>
+          </w:tcPr>
+          <w:p>
+            <w:r>
+              <w:t>artifact/data_transformation/v{N}/cleaned.csv</w:t>
+            </w:r>
+          </w:p>
+        </w:tc>
+        <w:tc>
+          <w:tcPr>
+            <w:tcW w:type="dxa" w:w="4703"/>
+          </w:tcPr>
+          <w:p>
+            <w:r>
+              <w:t>Feature-engineered cleaned data for run N</w:t>
+            </w:r>
+          </w:p>
+        </w:tc>
+      </w:tr>
+      <w:tr>
+        <w:tc>
+          <w:tcPr>
+            <w:tcW w:type="dxa" w:w="4703"/>
+          </w:tcPr>
+          <w:p>
+            <w:r>
+              <w:t>artifact/apt_model_trainer/v{N}/*.pkl</w:t>
+            </w:r>
+          </w:p>
+        </w:tc>
+        <w:tc>
+          <w:tcPr>
+            <w:tcW w:type="dxa" w:w="4703"/>
+          </w:tcPr>
+          <w:p>
+            <w:r>
+              <w:t>Versioned apartment model bundle for run N</w:t>
+            </w:r>
+          </w:p>
+        </w:tc>
+      </w:tr>
+      <w:tr>
+        <w:tc>
+          <w:tcPr>
+            <w:tcW w:type="dxa" w:w="4703"/>
+          </w:tcPr>
+          <w:p>
+            <w:r>
+              <w:t>artifact/bf_model_trainer/v{N}/*.pkl</w:t>
+            </w:r>
+          </w:p>
+        </w:tc>
+        <w:tc>
+          <w:tcPr>
+            <w:tcW w:type="dxa" w:w="4703"/>
+          </w:tcPr>
+          <w:p>
+            <w:r>
+              <w:t>Versioned builder floor model bundle for run N</w:t>
+            </w:r>
+          </w:p>
+        </w:tc>
+      </w:tr>
+      <w:tr>
+        <w:tc>
+          <w:tcPr>
+            <w:tcW w:type="dxa" w:w="4703"/>
+          </w:tcPr>
+          <w:p>
+            <w:r>
+              <w:t>artifact/plot_model_trainer/v{N}/*.pkl</w:t>
+            </w:r>
+          </w:p>
+        </w:tc>
+        <w:tc>
+          <w:tcPr>
+            <w:tcW w:type="dxa" w:w="4703"/>
+          </w:tcPr>
+          <w:p>
+            <w:r>
+              <w:t>Versioned plot model bundle for run N</w:t>
+            </w:r>
+          </w:p>
+        </w:tc>
+      </w:tr>
+      <w:tr>
+        <w:tc>
+          <w:tcPr>
+            <w:tcW w:type="dxa" w:w="4703"/>
+          </w:tcPr>
+          <w:p>
+            <w:r>
+              <w:t>artifact/apt_model_trainer/best_apt_random_forest.pkl</w:t>
+            </w:r>
+          </w:p>
+        </w:tc>
+        <w:tc>
+          <w:tcPr>
+            <w:tcW w:type="dxa" w:w="4703"/>
+          </w:tcPr>
+          <w:p>
+            <w:r>
+              <w:t>Canonical apt model (API always reads this)</w:t>
+            </w:r>
+          </w:p>
+        </w:tc>
+      </w:tr>
+      <w:tr>
+        <w:tc>
+          <w:tcPr>
+            <w:tcW w:type="dxa" w:w="4703"/>
+          </w:tcPr>
+          <w:p>
+            <w:r>
+              <w:t>artifact/bf_model_trainer/best_bf_random_forest.pkl</w:t>
+            </w:r>
+          </w:p>
+        </w:tc>
+        <w:tc>
+          <w:tcPr>
+            <w:tcW w:type="dxa" w:w="4703"/>
+          </w:tcPr>
+          <w:p>
+            <w:r>
+              <w:t>Canonical BF model (API always reads this)</w:t>
+            </w:r>
+          </w:p>
+        </w:tc>
+      </w:tr>
+      <w:tr>
+        <w:tc>
+          <w:tcPr>
+            <w:tcW w:type="dxa" w:w="4703"/>
+          </w:tcPr>
+          <w:p>
+            <w:r>
+              <w:t>artifact/plot_model_trainer/plot_v3_production_model.pkl</w:t>
+            </w:r>
+          </w:p>
+        </w:tc>
+        <w:tc>
+          <w:tcPr>
+            <w:tcW w:type="dxa" w:w="4703"/>
+          </w:tcPr>
+          <w:p>
+            <w:r>
+              <w:t>Canonical plot model (API always reads this)</w:t>
+            </w:r>
+          </w:p>
+        </w:tc>
+      </w:tr>
+    </w:tbl>
+    <w:p>
+      <w:pPr>
+        <w:pStyle w:val="Heading2"/>
+      </w:pPr>
+      <w:r>
+        <w:t>14.3 Model Registry (model_registry.json)</w:t>
+      </w:r>
+    </w:p>
+    <w:p>
+      <w:r>
+        <w:t>The utility functions get_next_model_version() and register_model_version() in real_estate/utils/__init__.py auto-increment the version counter and write a timestamped entry for every training run. The registry enables full auditability and rollback.</w:t>
+      </w:r>
+    </w:p>
+    <w:tbl>
+      <w:tblPr>
+        <w:tblStyle w:val="TableGrid"/>
+        <w:tblW w:type="auto" w:w="0"/>
+        <w:tblLook w:firstColumn="1" w:firstRow="1" w:lastColumn="0" w:lastRow="0" w:noHBand="0" w:noVBand="1" w:val="04A0"/>
+      </w:tblPr>
+      <w:tblGrid>
+        <w:gridCol w:w="4703"/>
+        <w:gridCol w:w="4703"/>
+      </w:tblGrid>
+      <w:tr>
+        <w:tc>
+          <w:tcPr>
+            <w:tcW w:type="dxa" w:w="4703"/>
+          </w:tcPr>
+          <w:p>
+            <w:r>
+              <w:rPr>
+                <w:b/>
+              </w:rPr>
+              <w:t>Registry Field</w:t>
+            </w:r>
+          </w:p>
+        </w:tc>
+        <w:tc>
+          <w:tcPr>
+            <w:tcW w:type="dxa" w:w="4703"/>
+          </w:tcPr>
+          <w:p>
+            <w:r>
+              <w:rPr>
+                <w:b/>
+              </w:rPr>
+              <w:t>Description</w:t>
+            </w:r>
+          </w:p>
+        </w:tc>
+      </w:tr>
+      <w:tr>
+        <w:tc>
+          <w:tcPr>
+            <w:tcW w:type="dxa" w:w="4703"/>
+          </w:tcPr>
+          <w:p>
+            <w:r>
+              <w:t>latest</w:t>
+            </w:r>
+          </w:p>
+        </w:tc>
+        <w:tc>
+          <w:tcPr>
+            <w:tcW w:type="dxa" w:w="4703"/>
+          </w:tcPr>
+          <w:p>
+            <w:r>
+              <w:t>Current highest version number for the segment</w:t>
+            </w:r>
+          </w:p>
+        </w:tc>
+      </w:tr>
+      <w:tr>
+        <w:tc>
+          <w:tcPr>
+            <w:tcW w:type="dxa" w:w="4703"/>
+          </w:tcPr>
+          <w:p>
+            <w:r>
+              <w:t>timestamp</w:t>
+            </w:r>
+          </w:p>
+        </w:tc>
+        <w:tc>
+          <w:tcPr>
+            <w:tcW w:type="dxa" w:w="4703"/>
+          </w:tcPr>
+          <w:p>
+            <w:r>
+              <w:t>UTC ISO-8601 datetime of the training run</w:t>
+            </w:r>
+          </w:p>
+        </w:tc>
+      </w:tr>
+      <w:tr>
+        <w:tc>
+          <w:tcPr>
+            <w:tcW w:type="dxa" w:w="4703"/>
+          </w:tcPr>
+          <w:p>
+            <w:r>
+              <w:t>model_path</w:t>
+            </w:r>
+          </w:p>
+        </w:tc>
+        <w:tc>
+          <w:tcPr>
+            <w:tcW w:type="dxa" w:w="4703"/>
+          </w:tcPr>
+          <w:p>
+            <w:r>
+              <w:t>Relative path to the versioned .pkl model file</w:t>
+            </w:r>
+          </w:p>
+        </w:tc>
+      </w:tr>
+      <w:tr>
+        <w:tc>
+          <w:tcPr>
+            <w:tcW w:type="dxa" w:w="4703"/>
+          </w:tcPr>
+          <w:p>
+            <w:r>
+              <w:t>mae</w:t>
+            </w:r>
+          </w:p>
+        </w:tc>
+        <w:tc>
+          <w:tcPr>
+            <w:tcW w:type="dxa" w:w="4703"/>
+          </w:tcPr>
+          <w:p>
+            <w:r>
+              <w:t>Mean Absolute Error in INR/sqft on held-out test set</w:t>
+            </w:r>
+          </w:p>
+        </w:tc>
+      </w:tr>
+      <w:tr>
+        <w:tc>
+          <w:tcPr>
+            <w:tcW w:type="dxa" w:w="4703"/>
+          </w:tcPr>
+          <w:p>
+            <w:r>
+              <w:t>mape</w:t>
+            </w:r>
+          </w:p>
+        </w:tc>
+        <w:tc>
+          <w:tcPr>
+            <w:tcW w:type="dxa" w:w="4703"/>
+          </w:tcPr>
+          <w:p>
+            <w:r>
+              <w:t>Mean Absolute Percentage Error (0–1 scale)</w:t>
+            </w:r>
+          </w:p>
+        </w:tc>
+      </w:tr>
+      <w:tr>
+        <w:tc>
+          <w:tcPr>
+            <w:tcW w:type="dxa" w:w="4703"/>
+          </w:tcPr>
+          <w:p>
+            <w:r>
+              <w:t>r2</w:t>
+            </w:r>
+          </w:p>
+        </w:tc>
+        <w:tc>
+          <w:tcPr>
+            <w:tcW w:type="dxa" w:w="4703"/>
+          </w:tcPr>
+          <w:p>
+            <w:r>
+              <w:t>R² coefficient of determination on held-out test set</w:t>
+            </w:r>
+          </w:p>
+        </w:tc>
+      </w:tr>
+      <w:tr>
+        <w:tc>
+          <w:tcPr>
+            <w:tcW w:type="dxa" w:w="4703"/>
+          </w:tcPr>
+          <w:p>
+            <w:r>
+              <w:t>best_model</w:t>
+            </w:r>
+          </w:p>
+        </w:tc>
+        <w:tc>
+          <w:tcPr>
+            <w:tcW w:type="dxa" w:w="4703"/>
+          </w:tcPr>
+          <w:p>
+            <w:r>
+              <w:t>Algorithm selected by cross-validation (LightGBM / XGBoost / RandomForest)</w:t>
+            </w:r>
+          </w:p>
+        </w:tc>
+      </w:tr>
+      <w:tr>
+        <w:tc>
+          <w:tcPr>
+            <w:tcW w:type="dxa" w:w="4703"/>
+          </w:tcPr>
+          <w:p>
+            <w:r>
+              <w:t>data_version</w:t>
+            </w:r>
+          </w:p>
+        </w:tc>
+        <w:tc>
+          <w:tcPr>
+            <w:tcW w:type="dxa" w:w="4703"/>
+          </w:tcPr>
+          <w:p>
+            <w:r>
+              <w:t>Version of data_ingestion artifact used for this run</w:t>
+            </w:r>
+          </w:p>
+        </w:tc>
+      </w:tr>
+    </w:tbl>
+    <w:p>
+      <w:pPr>
+        <w:pStyle w:val="Heading2"/>
+      </w:pPr>
+      <w:r>
+        <w:t>14.4 MLflow Experiments</w:t>
+      </w:r>
+    </w:p>
+    <w:p>
+      <w:r>
+        <w:t>MLflow tracks three experiments (one per segment) against a local SQLite store at artifact/mlflow.db. The UI can be launched at any time to compare runs.</w:t>
+      </w:r>
+    </w:p>
+    <w:tbl>
+      <w:tblPr>
+        <w:tblStyle w:val="TableGrid"/>
+        <w:tblW w:type="auto" w:w="0"/>
+        <w:tblLook w:firstColumn="1" w:firstRow="1" w:lastColumn="0" w:lastRow="0" w:noHBand="0" w:noVBand="1" w:val="04A0"/>
+      </w:tblPr>
+      <w:tblGrid>
+        <w:gridCol w:w="3135"/>
+        <w:gridCol w:w="3135"/>
+        <w:gridCol w:w="3135"/>
+      </w:tblGrid>
+      <w:tr>
+        <w:tc>
+          <w:tcPr>
+            <w:tcW w:type="dxa" w:w="3135"/>
+          </w:tcPr>
+          <w:p>
+            <w:r>
+              <w:rPr>
+                <w:b/>
+              </w:rPr>
+              <w:t>Experiment Name</w:t>
+            </w:r>
+          </w:p>
+        </w:tc>
+        <w:tc>
+          <w:tcPr>
+            <w:tcW w:type="dxa" w:w="3135"/>
+          </w:tcPr>
+          <w:p>
+            <w:r>
+              <w:rPr>
+                <w:b/>
+              </w:rPr>
+              <w:t>Tracked Params</w:t>
+            </w:r>
+          </w:p>
+        </w:tc>
+        <w:tc>
+          <w:tcPr>
+            <w:tcW w:type="dxa" w:w="3135"/>
+          </w:tcPr>
+          <w:p>
+            <w:r>
+              <w:rPr>
+                <w:b/>
+              </w:rPr>
+              <w:t>Tracked Metrics</w:t>
+            </w:r>
+          </w:p>
+        </w:tc>
+      </w:tr>
+      <w:tr>
+        <w:tc>
+          <w:tcPr>
+            <w:tcW w:type="dxa" w:w="3135"/>
+          </w:tcPr>
+          <w:p>
+            <w:r>
+              <w:t>apartment-price-model</w:t>
+            </w:r>
+          </w:p>
+        </w:tc>
+        <w:tc>
+          <w:tcPr>
+            <w:tcW w:type="dxa" w:w="3135"/>
+          </w:tcPr>
+          <w:p>
+            <w:r>
+              <w:t>model_type, version, n_features, n_training_rows, n_voronoi_clusters</w:t>
+            </w:r>
+          </w:p>
+        </w:tc>
+        <w:tc>
+          <w:tcPr>
+            <w:tcW w:type="dxa" w:w="3135"/>
+          </w:tcPr>
+          <w:p>
+            <w:r>
+              <w:t>mae, mape, r2</w:t>
+            </w:r>
+          </w:p>
+        </w:tc>
+      </w:tr>
+      <w:tr>
+        <w:tc>
+          <w:tcPr>
+            <w:tcW w:type="dxa" w:w="3135"/>
+          </w:tcPr>
+          <w:p>
+            <w:r>
+              <w:t>builder-floor-price-model</w:t>
+            </w:r>
+          </w:p>
+        </w:tc>
+        <w:tc>
+          <w:tcPr>
+            <w:tcW w:type="dxa" w:w="3135"/>
+          </w:tcPr>
+          <w:p>
+            <w:r>
+              <w:t>model_type, version, n_features, n_training_rows, n_voronoi_clusters</w:t>
+            </w:r>
+          </w:p>
+        </w:tc>
+        <w:tc>
+          <w:tcPr>
+            <w:tcW w:type="dxa" w:w="3135"/>
+          </w:tcPr>
+          <w:p>
+            <w:r>
+              <w:t>mae, mape, r2</w:t>
+            </w:r>
+          </w:p>
+        </w:tc>
+      </w:tr>
+      <w:tr>
+        <w:tc>
+          <w:tcPr>
+            <w:tcW w:type="dxa" w:w="3135"/>
+          </w:tcPr>
+          <w:p>
+            <w:r>
+              <w:t>plot-price-model</w:t>
+            </w:r>
+          </w:p>
+        </w:tc>
+        <w:tc>
+          <w:tcPr>
+            <w:tcW w:type="dxa" w:w="3135"/>
+          </w:tcPr>
+          <w:p>
+            <w:r>
+              <w:t>model_type, version, n_features, n_training_rows, n_voronoi_clusters</w:t>
+            </w:r>
+          </w:p>
+        </w:tc>
+        <w:tc>
+          <w:tcPr>
+            <w:tcW w:type="dxa" w:w="3135"/>
+          </w:tcPr>
+          <w:p>
+            <w:r>
+              <w:t>mae, mape, r2</w:t>
+            </w:r>
+          </w:p>
+        </w:tc>
+      </w:tr>
+    </w:tbl>
+    <w:p>
+      <w:r>
+        <w:rPr>
+          <w:b/>
+        </w:rPr>
+        <w:t xml:space="preserve">Launch MLflow UI:  </w:t>
+      </w:r>
+      <w:r/>
+    </w:p>
+    <w:p>
+      <w:r>
+        <w:t>mlflow ui --backend-store-uri sqlite:///artifact/mlflow.db --port 5000</w:t>
+      </w:r>
+    </w:p>
+    <w:p>
+      <w:r>
+        <w:t>Then open http://localhost:5000 in a browser to compare runs side-by-side.</w:t>
+      </w:r>
+    </w:p>
+    <w:p>
+      <w:pPr>
+        <w:pStyle w:val="Heading2"/>
+      </w:pPr>
+      <w:r>
+        <w:t>14.5 Re-Training &amp; Rollback Workflow</w:t>
+      </w:r>
+    </w:p>
+    <w:tbl>
+      <w:tblPr>
+        <w:tblStyle w:val="TableGrid"/>
+        <w:tblW w:type="auto" w:w="0"/>
+        <w:tblLook w:firstColumn="1" w:firstRow="1" w:lastColumn="0" w:lastRow="0" w:noHBand="0" w:noVBand="1" w:val="04A0"/>
+      </w:tblPr>
+      <w:tblGrid>
+        <w:gridCol w:w="3135"/>
+        <w:gridCol w:w="3135"/>
+        <w:gridCol w:w="3135"/>
+      </w:tblGrid>
+      <w:tr>
+        <w:tc>
+          <w:tcPr>
+            <w:tcW w:type="dxa" w:w="3135"/>
+          </w:tcPr>
+          <w:p>
+            <w:r>
+              <w:rPr>
+                <w:b/>
+              </w:rPr>
+              <w:t>Step</w:t>
+            </w:r>
+          </w:p>
+        </w:tc>
+        <w:tc>
+          <w:tcPr>
+            <w:tcW w:type="dxa" w:w="3135"/>
+          </w:tcPr>
+          <w:p>
+            <w:r>
+              <w:rPr>
+                <w:b/>
+              </w:rPr>
+              <w:t>Action</w:t>
+            </w:r>
+          </w:p>
+        </w:tc>
+        <w:tc>
+          <w:tcPr>
+            <w:tcW w:type="dxa" w:w="3135"/>
+          </w:tcPr>
+          <w:p>
+            <w:r>
+              <w:rPr>
+                <w:b/>
+              </w:rPr>
+              <w:t>Result</w:t>
+            </w:r>
+          </w:p>
+        </w:tc>
+      </w:tr>
+      <w:tr>
+        <w:tc>
+          <w:tcPr>
+            <w:tcW w:type="dxa" w:w="3135"/>
+          </w:tcPr>
+          <w:p>
+            <w:r>
+              <w:t>1</w:t>
+            </w:r>
+          </w:p>
+        </w:tc>
+        <w:tc>
+          <w:tcPr>
+            <w:tcW w:type="dxa" w:w="3135"/>
+          </w:tcPr>
+          <w:p>
+            <w:r>
+              <w:t>New data available → run python app_apt_train.py (or bf/plot)</w:t>
+            </w:r>
+          </w:p>
+        </w:tc>
+        <w:tc>
+          <w:tcPr>
+            <w:tcW w:type="dxa" w:w="3135"/>
+          </w:tcPr>
+          <w:p>
+            <w:r>
+              <w:t>New v{N+1} artifact snapshot created</w:t>
+            </w:r>
+          </w:p>
+        </w:tc>
+      </w:tr>
+      <w:tr>
+        <w:tc>
+          <w:tcPr>
+            <w:tcW w:type="dxa" w:w="3135"/>
+          </w:tcPr>
+          <w:p>
+            <w:r>
+              <w:t>2</w:t>
+            </w:r>
+          </w:p>
+        </w:tc>
+        <w:tc>
+          <w:tcPr>
+            <w:tcW w:type="dxa" w:w="3135"/>
+          </w:tcPr>
+          <w:p>
+            <w:r>
+              <w:t>Training completes → model promoted to canonical path automatically</w:t>
+            </w:r>
+          </w:p>
+        </w:tc>
+        <w:tc>
+          <w:tcPr>
+            <w:tcW w:type="dxa" w:w="3135"/>
+          </w:tcPr>
+          <w:p>
+            <w:r>
+              <w:t>API serves new model without restart</w:t>
+            </w:r>
+          </w:p>
+        </w:tc>
+      </w:tr>
+      <w:tr>
+        <w:tc>
+          <w:tcPr>
+            <w:tcW w:type="dxa" w:w="3135"/>
+          </w:tcPr>
+          <w:p>
+            <w:r>
+              <w:t>3</w:t>
+            </w:r>
+          </w:p>
+        </w:tc>
+        <w:tc>
+          <w:tcPr>
+            <w:tcW w:type="dxa" w:w="3135"/>
+          </w:tcPr>
+          <w:p>
+            <w:r>
+              <w:t>Compare v{N} vs v{N+1} in MLflow UI (parallel coordinates chart)</w:t>
+            </w:r>
+          </w:p>
+        </w:tc>
+        <w:tc>
+          <w:tcPr>
+            <w:tcW w:type="dxa" w:w="3135"/>
+          </w:tcPr>
+          <w:p>
+            <w:r>
+              <w:t>Metric diff visible across all KPIs</w:t>
+            </w:r>
+          </w:p>
+        </w:tc>
+      </w:tr>
+      <w:tr>
+        <w:tc>
+          <w:tcPr>
+            <w:tcW w:type="dxa" w:w="3135"/>
+          </w:tcPr>
+          <w:p>
+            <w:r>
+              <w:t>4</w:t>
+            </w:r>
+          </w:p>
+        </w:tc>
+        <w:tc>
+          <w:tcPr>
+            <w:tcW w:type="dxa" w:w="3135"/>
+          </w:tcPr>
+          <w:p>
+            <w:r>
+              <w:t>Rollback if needed: copy v{N-1}/*.pkl back to canonical artifact dir</w:t>
+            </w:r>
+          </w:p>
+        </w:tc>
+        <w:tc>
+          <w:tcPr>
+            <w:tcW w:type="dxa" w:w="3135"/>
+          </w:tcPr>
+          <w:p>
+            <w:r>
+              <w:t>API instantly serves previous version</w:t>
+            </w:r>
+          </w:p>
+        </w:tc>
+      </w:tr>
+      <w:tr>
+        <w:tc>
+          <w:tcPr>
+            <w:tcW w:type="dxa" w:w="3135"/>
+          </w:tcPr>
+          <w:p>
+            <w:r>
+              <w:t>5</w:t>
+            </w:r>
+          </w:p>
+        </w:tc>
+        <w:tc>
+          <w:tcPr>
+            <w:tcW w:type="dxa" w:w="3135"/>
+          </w:tcPr>
+          <w:p>
+            <w:r>
+              <w:t>Audit history in model_registry.json or via /meta/model-registry API endpoint</w:t>
+            </w:r>
+          </w:p>
+        </w:tc>
+        <w:tc>
+          <w:tcPr>
+            <w:tcW w:type="dxa" w:w="3135"/>
+          </w:tcPr>
+          <w:p>
+            <w:r>
+              <w:t>Full version lineage preserved</w:t>
+            </w:r>
+          </w:p>
+        </w:tc>
+      </w:tr>
+    </w:tbl>
+    <w:p>
+      <w:pPr>
+        <w:pStyle w:val="Heading2"/>
+      </w:pPr>
+      <w:r>
+        <w:t>14.6 MLOps API Endpoints</w:t>
+      </w:r>
+    </w:p>
+    <w:tbl>
+      <w:tblPr>
+        <w:tblStyle w:val="TableGrid"/>
+        <w:tblW w:type="auto" w:w="0"/>
+        <w:tblLook w:firstColumn="1" w:firstRow="1" w:lastColumn="0" w:lastRow="0" w:noHBand="0" w:noVBand="1" w:val="04A0"/>
+      </w:tblPr>
+      <w:tblGrid>
+        <w:gridCol w:w="3135"/>
+        <w:gridCol w:w="3135"/>
+        <w:gridCol w:w="3135"/>
+      </w:tblGrid>
+      <w:tr>
+        <w:tc>
+          <w:tcPr>
+            <w:tcW w:type="dxa" w:w="3135"/>
+          </w:tcPr>
+          <w:p>
+            <w:r>
+              <w:rPr>
+                <w:b/>
+              </w:rPr>
+              <w:t>Endpoint</w:t>
+            </w:r>
+          </w:p>
+        </w:tc>
+        <w:tc>
+          <w:tcPr>
+            <w:tcW w:type="dxa" w:w="3135"/>
+          </w:tcPr>
+          <w:p>
+            <w:r>
+              <w:rPr>
+                <w:b/>
+              </w:rPr>
+              <w:t>Method</w:t>
+            </w:r>
+          </w:p>
+        </w:tc>
+        <w:tc>
+          <w:tcPr>
+            <w:tcW w:type="dxa" w:w="3135"/>
+          </w:tcPr>
+          <w:p>
+            <w:r>
+              <w:rPr>
+                <w:b/>
+              </w:rPr>
+              <w:t>Description</w:t>
+            </w:r>
+          </w:p>
+        </w:tc>
+      </w:tr>
+      <w:tr>
+        <w:tc>
+          <w:tcPr>
+            <w:tcW w:type="dxa" w:w="3135"/>
+          </w:tcPr>
+          <w:p>
+            <w:r>
+              <w:t>/meta/model-registry</w:t>
+            </w:r>
+          </w:p>
+        </w:tc>
+        <w:tc>
+          <w:tcPr>
+            <w:tcW w:type="dxa" w:w="3135"/>
+          </w:tcPr>
+          <w:p>
+            <w:r>
+              <w:t>GET</w:t>
+            </w:r>
+          </w:p>
+        </w:tc>
+        <w:tc>
+          <w:tcPr>
+            <w:tcW w:type="dxa" w:w="3135"/>
+          </w:tcPr>
+          <w:p>
+            <w:r>
+              <w:t>Full JSON view of model_registry.json — all versions, timestamps, metrics</w:t>
+            </w:r>
+          </w:p>
+        </w:tc>
+      </w:tr>
+      <w:tr>
+        <w:tc>
+          <w:tcPr>
+            <w:tcW w:type="dxa" w:w="3135"/>
+          </w:tcPr>
+          <w:p>
+            <w:r>
+              <w:t>/meta/model-status</w:t>
+            </w:r>
+          </w:p>
+        </w:tc>
+        <w:tc>
+          <w:tcPr>
+            <w:tcW w:type="dxa" w:w="3135"/>
+          </w:tcPr>
+          <w:p>
+            <w:r>
+              <w:t>GET</w:t>
+            </w:r>
+          </w:p>
+        </w:tc>
+        <w:tc>
+          <w:tcPr>
+            <w:tcW w:type="dxa" w:w="3135"/>
+          </w:tcPr>
+          <w:p>
+            <w:r>
+              <w:t>Which canonical model files are currently loaded in memory</w:t>
+            </w:r>
+          </w:p>
+        </w:tc>
+      </w:tr>
+    </w:tbl>
     <w:sectPr>
       <w:pgSz w:w="12240" w:h="15840"/>
       <w:pgMar w:top="1134" w:right="1417" w:bottom="1134" w:left="1417" w:header="720" w:footer="720" w:gutter="0"/>

</xml_diff>